<commit_message>
Implementato parser per il file degli eredi. Scritti test per parser.
</commit_message>
<xml_diff>
--- a/Note Power App.docx
+++ b/Note Power App.docx
@@ -12,23 +12,7 @@
     </w:p>
     <w:p>
       <w:r>
-        <w:t xml:space="preserve">Per costruire la bozza della Power App si può usare </w:t>
-      </w:r>
-      <w:proofErr w:type="spellStart"/>
-      <w:r>
-        <w:t>JavaFX</w:t>
-      </w:r>
-      <w:proofErr w:type="spellEnd"/>
-      <w:r>
-        <w:t>, un framework che permette di sviluppare applicazioni desktop cross-</w:t>
-      </w:r>
-      <w:proofErr w:type="spellStart"/>
-      <w:r>
-        <w:t>platform</w:t>
-      </w:r>
-      <w:proofErr w:type="spellEnd"/>
-      <w:r>
-        <w:t>.</w:t>
+        <w:t>Per costruire la bozza della Power App si può usare JavaFX, un framework che permette di sviluppare applicazioni desktop cross-platform.</w:t>
       </w:r>
     </w:p>
     <w:p>
@@ -62,37 +46,18 @@
     </w:p>
     <w:p>
       <w:pPr>
-        <w:rPr>
-          <w:b/>
-          <w:bCs/>
-        </w:rPr>
-      </w:pPr>
-      <w:r>
-        <w:rPr>
-          <w:b/>
-          <w:bCs/>
-        </w:rPr>
+        <w:pStyle w:val="Titolo2"/>
+      </w:pPr>
+      <w:r>
         <w:t xml:space="preserve">Funzionamento </w:t>
       </w:r>
       <w:r>
-        <w:rPr>
-          <w:b/>
-          <w:bCs/>
-        </w:rPr>
         <w:t>script</w:t>
       </w:r>
     </w:p>
     <w:p>
       <w:r>
-        <w:t xml:space="preserve">Lo script legge due file di testo: Comparti.txt e Eredi.txt. Sarà necessario definire una grammatica per i due file. Lo script effettua un </w:t>
-      </w:r>
-      <w:proofErr w:type="spellStart"/>
-      <w:r>
-        <w:t>parsing</w:t>
-      </w:r>
-      <w:proofErr w:type="spellEnd"/>
-      <w:r>
-        <w:t xml:space="preserve"> memorizzando la lista dei comparti e degli eredi. Successivamente vengono prodotti in output i file dell’anagrafica e della suddivisione.</w:t>
+        <w:t>Lo script legge due file di testo: Comparti.txt e Eredi.txt. Sarà necessario definire una grammatica per i due file. Lo script effettua un parsing memorizzando la lista dei comparti e degli eredi. Successivamente vengono prodotti in output i file dell’anagrafica e della suddivisione.</w:t>
       </w:r>
     </w:p>
     <w:p>
@@ -105,15 +70,7 @@
     </w:p>
     <w:p>
       <w:r>
-        <w:t xml:space="preserve">I file </w:t>
-      </w:r>
-      <w:proofErr w:type="spellStart"/>
-      <w:r>
-        <w:t>excel</w:t>
-      </w:r>
-      <w:proofErr w:type="spellEnd"/>
-      <w:r>
-        <w:t xml:space="preserve"> sono:</w:t>
+        <w:t>I file excel sono:</w:t>
       </w:r>
     </w:p>
     <w:p>
@@ -187,46 +144,123 @@
     </w:p>
     <w:p>
       <w:r>
+        <w:t>Cognome</w:t>
+      </w:r>
+    </w:p>
+    <w:p>
+      <w:r>
+        <w:t>Codice Fiscale</w:t>
+      </w:r>
+    </w:p>
+    <w:p>
+      <w:r>
+        <w:t>Quota</w:t>
+      </w:r>
+    </w:p>
+    <w:p/>
+    <w:p>
+      <w:r>
+        <w:t>ISIN: identifica il comparto</w:t>
+      </w:r>
+    </w:p>
+    <w:p/>
+    <w:p>
+      <w:r>
+        <w:t>Per costruire la bozza del programma, inserisci i dati tramite file txt (come il simulatore). Nella prima bozza, la modalità di suddivisione a percentuale fissa è sempre attiva.</w:t>
+      </w:r>
+    </w:p>
+    <w:p/>
+    <w:p>
+      <w:r>
+        <w:t>È necessario specificare le quote che spettano all’erede per ogni coppia (erede, comparto). Il comparto è costituito da quote, che hanno un valore corrispondente in euro. Tuttavia nel file Excel devono essere contenute le quote, non le quantità monetarie.</w:t>
+      </w:r>
+    </w:p>
+    <w:p>
+      <w:pPr>
+        <w:pStyle w:val="Titolo2"/>
+      </w:pPr>
+      <w:r>
         <w:lastRenderedPageBreak/>
+        <w:t>Eredi.txt</w:t>
+      </w:r>
+    </w:p>
+    <w:p>
+      <w:r>
+        <w:t>Nome</w:t>
+      </w:r>
+    </w:p>
+    <w:p>
+      <w:r>
         <w:t>Cognome</w:t>
       </w:r>
     </w:p>
     <w:p>
       <w:r>
+        <w:t>Data di nascita</w:t>
+      </w:r>
+      <w:r>
+        <w:t xml:space="preserve"> (cerca libreria per trasformare testo in un valore Date)</w:t>
+      </w:r>
+    </w:p>
+    <w:p>
+      <w:r>
         <w:t>Codice Fiscale</w:t>
       </w:r>
     </w:p>
     <w:p>
       <w:r>
-        <w:t>Quota</w:t>
+        <w:t>IBAN</w:t>
+      </w:r>
+      <w:r>
+        <w:t xml:space="preserve"> (valuta di creare una classe apposta per modellare l’iban e un metodo per verificarne la validità).</w:t>
+      </w:r>
+    </w:p>
+    <w:p>
+      <w:r>
+        <w:t>Percentuale ereditata</w:t>
+      </w:r>
+    </w:p>
+    <w:p>
+      <w:pPr>
+        <w:pStyle w:val="Titolo2"/>
+      </w:pPr>
+      <w:r>
+        <w:t>Comparti.txt</w:t>
+      </w:r>
+    </w:p>
+    <w:p>
+      <w:pPr>
+        <w:pStyle w:val="Titolo2"/>
+      </w:pPr>
+      <w:r>
+        <w:t>Funzionalità da implementare</w:t>
+      </w:r>
+    </w:p>
+    <w:p>
+      <w:pPr>
+        <w:pStyle w:val="Paragrafoelenco"/>
+        <w:numPr>
+          <w:ilvl w:val="0"/>
+          <w:numId w:val="2"/>
+        </w:numPr>
+      </w:pPr>
+      <w:r>
+        <w:t>Generazione ID dossier</w:t>
+      </w:r>
+    </w:p>
+    <w:p>
+      <w:pPr>
+        <w:pStyle w:val="Paragrafoelenco"/>
+        <w:numPr>
+          <w:ilvl w:val="0"/>
+          <w:numId w:val="2"/>
+        </w:numPr>
+      </w:pPr>
+      <w:r>
+        <w:t>Validazione formato codice fiscale</w:t>
       </w:r>
     </w:p>
     <w:p/>
-    <w:p>
-      <w:r>
-        <w:t>ISIN: identifica il comparto</w:t>
-      </w:r>
-    </w:p>
-    <w:p/>
-    <w:p>
-      <w:r>
-        <w:t xml:space="preserve">Per costruire la bozza del programma, inserisci i dati tramite file </w:t>
-      </w:r>
-      <w:proofErr w:type="spellStart"/>
-      <w:r>
-        <w:t>txt</w:t>
-      </w:r>
-      <w:proofErr w:type="spellEnd"/>
-      <w:r>
-        <w:t xml:space="preserve"> (come il simulatore). Nella prima bozza, la modalità di suddivisione a percentuale fissa è sempre attiva.</w:t>
-      </w:r>
-    </w:p>
-    <w:p/>
-    <w:p>
-      <w:r>
-        <w:t>È necessario specificare le quote che spettano all’erede per ogni coppia (erede, comparto). Il comparto è costituito da quote, che hanno un valore corrispondente in euro. Tuttavia nel file Excel devono essere contenute le quote, non le quantità monetarie.</w:t>
-      </w:r>
-    </w:p>
     <w:p/>
     <w:p/>
     <w:p/>
@@ -243,6 +277,119 @@
 <file path=word/numbering.xml><?xml version="1.0" encoding="utf-8"?>
 <w:numbering xmlns:wpc="http://schemas.microsoft.com/office/word/2010/wordprocessingCanvas" xmlns:cx="http://schemas.microsoft.com/office/drawing/2014/chartex" xmlns:cx1="http://schemas.microsoft.com/office/drawing/2015/9/8/chartex" xmlns:cx2="http://schemas.microsoft.com/office/drawing/2015/10/21/chartex" xmlns:cx3="http://schemas.microsoft.com/office/drawing/2016/5/9/chartex" xmlns:cx4="http://schemas.microsoft.com/office/drawing/2016/5/10/chartex" xmlns:cx5="http://schemas.microsoft.com/office/drawing/2016/5/11/chartex" xmlns:cx6="http://schemas.microsoft.com/office/drawing/2016/5/12/chartex" xmlns:cx7="http://schemas.microsoft.com/office/drawing/2016/5/13/chartex" xmlns:cx8="http://schemas.microsoft.com/office/drawing/2016/5/14/chartex" xmlns:mc="http://schemas.openxmlformats.org/markup-compatibility/2006" xmlns:aink="http://schemas.microsoft.com/office/drawing/2016/ink" xmlns:am3d="http://schemas.microsoft.com/office/drawing/2017/model3d" xmlns:o="urn:schemas-microsoft-com:office:office" xmlns:oel="http://schemas.microsoft.com/office/2019/extlst" xmlns:r="http://schemas.openxmlformats.org/officeDocument/2006/relationships" xmlns:m="http://schemas.openxmlformats.org/officeDocument/2006/math" xmlns:v="urn:schemas-microsoft-com:vml" xmlns:wp14="http://schemas.microsoft.com/office/word/2010/wordprocessingDrawing" xmlns:wp="http://schemas.openxmlformats.org/drawingml/2006/wordprocessingDrawing" xmlns:w10="urn:schemas-microsoft-com:office:word" xmlns:w="http://schemas.openxmlformats.org/wordprocessingml/2006/main" xmlns:w14="http://schemas.microsoft.com/office/word/2010/wordml" xmlns:w15="http://schemas.microsoft.com/office/word/2012/wordml" xmlns:w16cei="http://schemas.microsoft.com/office/word/2026/wordml/cei" xmlns:w16cex="http://schemas.microsoft.com/office/word/2018/wordml/cex" xmlns:w16cid="http://schemas.microsoft.com/office/word/2016/wordml/cid" xmlns:w16="http://schemas.microsoft.com/office/word/2018/wordml" xmlns:w16du="http://schemas.microsoft.com/office/word/2023/wordml/word16du" xmlns:w16sdtdh="http://schemas.microsoft.com/office/word/2020/wordml/sdtdatahash" xmlns:w16sdtfl="http://schemas.microsoft.com/office/word/2024/wordml/sdtformatlock" xmlns:w16se="http://schemas.microsoft.com/office/word/2015/wordml/symex" xmlns:wpg="http://schemas.microsoft.com/office/word/2010/wordprocessingGroup" xmlns:wpi="http://schemas.microsoft.com/office/word/2010/wordprocessingInk" xmlns:wne="http://schemas.microsoft.com/office/word/2006/wordml" xmlns:wps="http://schemas.microsoft.com/office/word/2010/wordprocessingShape" mc:Ignorable="w14 w15 w16se w16cid w16 w16cex w16sdtdh w16sdtfl w16du wp14">
   <w:abstractNum w:abstractNumId="0" w15:restartNumberingAfterBreak="0">
+    <w:nsid w:val="1E320E52"/>
+    <w:multiLevelType w:val="hybridMultilevel"/>
+    <w:tmpl w:val="380A2FF6"/>
+    <w:lvl w:ilvl="0" w:tplc="04100001">
+      <w:start w:val="1"/>
+      <w:numFmt w:val="bullet"/>
+      <w:lvlText w:val=""/>
+      <w:lvlJc w:val="left"/>
+      <w:pPr>
+        <w:ind w:left="720" w:hanging="360"/>
+      </w:pPr>
+      <w:rPr>
+        <w:rFonts w:ascii="Symbol" w:hAnsi="Symbol" w:hint="default"/>
+      </w:rPr>
+    </w:lvl>
+    <w:lvl w:ilvl="1" w:tplc="04100003" w:tentative="1">
+      <w:start w:val="1"/>
+      <w:numFmt w:val="bullet"/>
+      <w:lvlText w:val="o"/>
+      <w:lvlJc w:val="left"/>
+      <w:pPr>
+        <w:ind w:left="1440" w:hanging="360"/>
+      </w:pPr>
+      <w:rPr>
+        <w:rFonts w:ascii="Courier New" w:hAnsi="Courier New" w:cs="Courier New" w:hint="default"/>
+      </w:rPr>
+    </w:lvl>
+    <w:lvl w:ilvl="2" w:tplc="04100005" w:tentative="1">
+      <w:start w:val="1"/>
+      <w:numFmt w:val="bullet"/>
+      <w:lvlText w:val=""/>
+      <w:lvlJc w:val="left"/>
+      <w:pPr>
+        <w:ind w:left="2160" w:hanging="360"/>
+      </w:pPr>
+      <w:rPr>
+        <w:rFonts w:ascii="Wingdings" w:hAnsi="Wingdings" w:hint="default"/>
+      </w:rPr>
+    </w:lvl>
+    <w:lvl w:ilvl="3" w:tplc="04100001" w:tentative="1">
+      <w:start w:val="1"/>
+      <w:numFmt w:val="bullet"/>
+      <w:lvlText w:val=""/>
+      <w:lvlJc w:val="left"/>
+      <w:pPr>
+        <w:ind w:left="2880" w:hanging="360"/>
+      </w:pPr>
+      <w:rPr>
+        <w:rFonts w:ascii="Symbol" w:hAnsi="Symbol" w:hint="default"/>
+      </w:rPr>
+    </w:lvl>
+    <w:lvl w:ilvl="4" w:tplc="04100003" w:tentative="1">
+      <w:start w:val="1"/>
+      <w:numFmt w:val="bullet"/>
+      <w:lvlText w:val="o"/>
+      <w:lvlJc w:val="left"/>
+      <w:pPr>
+        <w:ind w:left="3600" w:hanging="360"/>
+      </w:pPr>
+      <w:rPr>
+        <w:rFonts w:ascii="Courier New" w:hAnsi="Courier New" w:cs="Courier New" w:hint="default"/>
+      </w:rPr>
+    </w:lvl>
+    <w:lvl w:ilvl="5" w:tplc="04100005" w:tentative="1">
+      <w:start w:val="1"/>
+      <w:numFmt w:val="bullet"/>
+      <w:lvlText w:val=""/>
+      <w:lvlJc w:val="left"/>
+      <w:pPr>
+        <w:ind w:left="4320" w:hanging="360"/>
+      </w:pPr>
+      <w:rPr>
+        <w:rFonts w:ascii="Wingdings" w:hAnsi="Wingdings" w:hint="default"/>
+      </w:rPr>
+    </w:lvl>
+    <w:lvl w:ilvl="6" w:tplc="04100001" w:tentative="1">
+      <w:start w:val="1"/>
+      <w:numFmt w:val="bullet"/>
+      <w:lvlText w:val=""/>
+      <w:lvlJc w:val="left"/>
+      <w:pPr>
+        <w:ind w:left="5040" w:hanging="360"/>
+      </w:pPr>
+      <w:rPr>
+        <w:rFonts w:ascii="Symbol" w:hAnsi="Symbol" w:hint="default"/>
+      </w:rPr>
+    </w:lvl>
+    <w:lvl w:ilvl="7" w:tplc="04100003" w:tentative="1">
+      <w:start w:val="1"/>
+      <w:numFmt w:val="bullet"/>
+      <w:lvlText w:val="o"/>
+      <w:lvlJc w:val="left"/>
+      <w:pPr>
+        <w:ind w:left="5760" w:hanging="360"/>
+      </w:pPr>
+      <w:rPr>
+        <w:rFonts w:ascii="Courier New" w:hAnsi="Courier New" w:cs="Courier New" w:hint="default"/>
+      </w:rPr>
+    </w:lvl>
+    <w:lvl w:ilvl="8" w:tplc="04100005" w:tentative="1">
+      <w:start w:val="1"/>
+      <w:numFmt w:val="bullet"/>
+      <w:lvlText w:val=""/>
+      <w:lvlJc w:val="left"/>
+      <w:pPr>
+        <w:ind w:left="6480" w:hanging="360"/>
+      </w:pPr>
+      <w:rPr>
+        <w:rFonts w:ascii="Wingdings" w:hAnsi="Wingdings" w:hint="default"/>
+      </w:rPr>
+    </w:lvl>
+  </w:abstractNum>
+  <w:abstractNum w:abstractNumId="1" w15:restartNumberingAfterBreak="0">
     <w:nsid w:val="6EB157A2"/>
     <w:multiLevelType w:val="hybridMultilevel"/>
     <w:tmpl w:val="7226BF60"/>
@@ -329,6 +476,9 @@
     </w:lvl>
   </w:abstractNum>
   <w:num w:numId="1" w16cid:durableId="152334329">
+    <w:abstractNumId w:val="1"/>
+  </w:num>
+  <w:num w:numId="2" w16cid:durableId="1464159047">
     <w:abstractNumId w:val="0"/>
   </w:num>
 </w:numbering>
@@ -734,6 +884,10 @@
   <w:style w:type="paragraph" w:default="1" w:styleId="Normale">
     <w:name w:val="Normal"/>
     <w:qFormat/>
+    <w:rsid w:val="005A671D"/>
+    <w:pPr>
+      <w:spacing w:after="0" w:line="240" w:lineRule="auto"/>
+    </w:pPr>
   </w:style>
   <w:style w:type="paragraph" w:styleId="Titolo1">
     <w:name w:val="heading 1"/>
@@ -762,21 +916,18 @@
     <w:next w:val="Normale"/>
     <w:link w:val="Titolo2Carattere"/>
     <w:uiPriority w:val="9"/>
-    <w:semiHidden/>
     <w:unhideWhenUsed/>
     <w:qFormat/>
-    <w:rsid w:val="00867492"/>
+    <w:rsid w:val="001342DB"/>
     <w:pPr>
-      <w:keepNext/>
-      <w:keepLines/>
       <w:spacing w:before="160" w:after="80"/>
       <w:outlineLvl w:val="1"/>
     </w:pPr>
     <w:rPr>
-      <w:rFonts w:asciiTheme="majorHAnsi" w:eastAsiaTheme="majorEastAsia" w:hAnsiTheme="majorHAnsi" w:cstheme="majorBidi"/>
-      <w:color w:val="0F4761" w:themeColor="accent1" w:themeShade="BF"/>
-      <w:sz w:val="32"/>
-      <w:szCs w:val="32"/>
+      <w:b/>
+      <w:bCs/>
+      <w:sz w:val="28"/>
+      <w:szCs w:val="28"/>
     </w:rPr>
   </w:style>
   <w:style w:type="paragraph" w:styleId="Titolo3">
@@ -859,7 +1010,7 @@
     <w:pPr>
       <w:keepNext/>
       <w:keepLines/>
-      <w:spacing w:before="40" w:after="0"/>
+      <w:spacing w:before="40"/>
       <w:outlineLvl w:val="5"/>
     </w:pPr>
     <w:rPr>
@@ -882,7 +1033,7 @@
     <w:pPr>
       <w:keepNext/>
       <w:keepLines/>
-      <w:spacing w:before="40" w:after="0"/>
+      <w:spacing w:before="40"/>
       <w:outlineLvl w:val="6"/>
     </w:pPr>
     <w:rPr>
@@ -903,7 +1054,6 @@
     <w:pPr>
       <w:keepNext/>
       <w:keepLines/>
-      <w:spacing w:after="0"/>
       <w:outlineLvl w:val="7"/>
     </w:pPr>
     <w:rPr>
@@ -926,7 +1076,6 @@
     <w:pPr>
       <w:keepNext/>
       <w:keepLines/>
-      <w:spacing w:after="0"/>
       <w:outlineLvl w:val="8"/>
     </w:pPr>
     <w:rPr>
@@ -979,13 +1128,12 @@
     <w:basedOn w:val="Carpredefinitoparagrafo"/>
     <w:link w:val="Titolo2"/>
     <w:uiPriority w:val="9"/>
-    <w:semiHidden/>
-    <w:rsid w:val="00867492"/>
-    <w:rPr>
-      <w:rFonts w:asciiTheme="majorHAnsi" w:eastAsiaTheme="majorEastAsia" w:hAnsiTheme="majorHAnsi" w:cstheme="majorBidi"/>
-      <w:color w:val="0F4761" w:themeColor="accent1" w:themeShade="BF"/>
-      <w:sz w:val="32"/>
-      <w:szCs w:val="32"/>
+    <w:rsid w:val="001342DB"/>
+    <w:rPr>
+      <w:b/>
+      <w:bCs/>
+      <w:sz w:val="28"/>
+      <w:szCs w:val="28"/>
     </w:rPr>
   </w:style>
   <w:style w:type="character" w:customStyle="1" w:styleId="Titolo3Carattere">
@@ -1089,7 +1237,7 @@
     <w:qFormat/>
     <w:rsid w:val="00867492"/>
     <w:pPr>
-      <w:spacing w:after="80" w:line="240" w:lineRule="auto"/>
+      <w:spacing w:after="80"/>
       <w:contextualSpacing/>
     </w:pPr>
     <w:rPr>

</xml_diff>

<commit_message>
Implementato parser per comparti. Iniziata scrittura test per parser comparti.
</commit_message>
<xml_diff>
--- a/Note Power App.docx
+++ b/Note Power App.docx
@@ -1,6 +1,6 @@
 
 <file path=word/document.xml><?xml version="1.0" encoding="utf-8"?>
-<w:document xmlns:wpc="http://schemas.microsoft.com/office/word/2010/wordprocessingCanvas" xmlns:cx="http://schemas.microsoft.com/office/drawing/2014/chartex" xmlns:cx1="http://schemas.microsoft.com/office/drawing/2015/9/8/chartex" xmlns:cx2="http://schemas.microsoft.com/office/drawing/2015/10/21/chartex" xmlns:cx3="http://schemas.microsoft.com/office/drawing/2016/5/9/chartex" xmlns:cx4="http://schemas.microsoft.com/office/drawing/2016/5/10/chartex" xmlns:cx5="http://schemas.microsoft.com/office/drawing/2016/5/11/chartex" xmlns:cx6="http://schemas.microsoft.com/office/drawing/2016/5/12/chartex" xmlns:cx7="http://schemas.microsoft.com/office/drawing/2016/5/13/chartex" xmlns:cx8="http://schemas.microsoft.com/office/drawing/2016/5/14/chartex" xmlns:mc="http://schemas.openxmlformats.org/markup-compatibility/2006" xmlns:aink="http://schemas.microsoft.com/office/drawing/2016/ink" xmlns:am3d="http://schemas.microsoft.com/office/drawing/2017/model3d" xmlns:o="urn:schemas-microsoft-com:office:office" xmlns:oel="http://schemas.microsoft.com/office/2019/extlst" xmlns:r="http://schemas.openxmlformats.org/officeDocument/2006/relationships" xmlns:m="http://schemas.openxmlformats.org/officeDocument/2006/math" xmlns:v="urn:schemas-microsoft-com:vml" xmlns:wp14="http://schemas.microsoft.com/office/word/2010/wordprocessingDrawing" xmlns:wp="http://schemas.openxmlformats.org/drawingml/2006/wordprocessingDrawing" xmlns:w10="urn:schemas-microsoft-com:office:word" xmlns:w="http://schemas.openxmlformats.org/wordprocessingml/2006/main" xmlns:w14="http://schemas.microsoft.com/office/word/2010/wordml" xmlns:w15="http://schemas.microsoft.com/office/word/2012/wordml" xmlns:w16cei="http://schemas.microsoft.com/office/word/2026/wordml/cei" xmlns:w16cex="http://schemas.microsoft.com/office/word/2018/wordml/cex" xmlns:w16cid="http://schemas.microsoft.com/office/word/2016/wordml/cid" xmlns:w16="http://schemas.microsoft.com/office/word/2018/wordml" xmlns:w16du="http://schemas.microsoft.com/office/word/2023/wordml/word16du" xmlns:w16sdtdh="http://schemas.microsoft.com/office/word/2020/wordml/sdtdatahash" xmlns:w16sdtfl="http://schemas.microsoft.com/office/word/2024/wordml/sdtformatlock" xmlns:w16se="http://schemas.microsoft.com/office/word/2015/wordml/symex" xmlns:wpg="http://schemas.microsoft.com/office/word/2010/wordprocessingGroup" xmlns:wpi="http://schemas.microsoft.com/office/word/2010/wordprocessingInk" xmlns:wne="http://schemas.microsoft.com/office/word/2006/wordml" xmlns:wps="http://schemas.microsoft.com/office/word/2010/wordprocessingShape" mc:Ignorable="w14 w15 w16se w16cid w16 w16cex w16sdtdh w16sdtfl w16du wp14">
+<w:document xmlns:wpc="http://schemas.microsoft.com/office/word/2010/wordprocessingCanvas" xmlns:cx="http://schemas.microsoft.com/office/drawing/2014/chartex" xmlns:cx1="http://schemas.microsoft.com/office/drawing/2015/9/8/chartex" xmlns:cx2="http://schemas.microsoft.com/office/drawing/2015/10/21/chartex" xmlns:cx3="http://schemas.microsoft.com/office/drawing/2016/5/9/chartex" xmlns:cx4="http://schemas.microsoft.com/office/drawing/2016/5/10/chartex" xmlns:cx5="http://schemas.microsoft.com/office/drawing/2016/5/11/chartex" xmlns:cx6="http://schemas.microsoft.com/office/drawing/2016/5/12/chartex" xmlns:cx7="http://schemas.microsoft.com/office/drawing/2016/5/13/chartex" xmlns:cx8="http://schemas.microsoft.com/office/drawing/2016/5/14/chartex" xmlns:mc="http://schemas.openxmlformats.org/markup-compatibility/2006" xmlns:aink="http://schemas.microsoft.com/office/drawing/2016/ink" xmlns:am3d="http://schemas.microsoft.com/office/drawing/2017/model3d" xmlns:o="urn:schemas-microsoft-com:office:office" xmlns:oel="http://schemas.microsoft.com/office/2019/extlst" xmlns:r="http://schemas.openxmlformats.org/officeDocument/2006/relationships" xmlns:m="http://schemas.openxmlformats.org/officeDocument/2006/math" xmlns:v="urn:schemas-microsoft-com:vml" xmlns:wp14="http://schemas.microsoft.com/office/word/2010/wordprocessingDrawing" xmlns:wp="http://schemas.openxmlformats.org/drawingml/2006/wordprocessingDrawing" xmlns:w10="urn:schemas-microsoft-com:office:word" xmlns:w="http://schemas.openxmlformats.org/wordprocessingml/2006/main" xmlns:w14="http://schemas.microsoft.com/office/word/2010/wordml" xmlns:w15="http://schemas.microsoft.com/office/word/2012/wordml" xmlns:w16cex="http://schemas.microsoft.com/office/word/2018/wordml/cex" xmlns:w16cid="http://schemas.microsoft.com/office/word/2016/wordml/cid" xmlns:w16="http://schemas.microsoft.com/office/word/2018/wordml" xmlns:w16du="http://schemas.microsoft.com/office/word/2023/wordml/word16du" xmlns:w16sdtdh="http://schemas.microsoft.com/office/word/2020/wordml/sdtdatahash" xmlns:w16sdtfl="http://schemas.microsoft.com/office/word/2024/wordml/sdtformatlock" xmlns:w16se="http://schemas.microsoft.com/office/word/2015/wordml/symex" xmlns:wpg="http://schemas.microsoft.com/office/word/2010/wordprocessingGroup" xmlns:wpi="http://schemas.microsoft.com/office/word/2010/wordprocessingInk" xmlns:wne="http://schemas.microsoft.com/office/word/2006/wordml" xmlns:wps="http://schemas.microsoft.com/office/word/2010/wordprocessingShape" mc:Ignorable="w14 w15 w16se w16cid w16 w16cex w16sdtdh w16sdtfl w16du wp14">
   <w:body>
     <w:p>
       <w:pPr>
@@ -12,7 +12,23 @@
     </w:p>
     <w:p>
       <w:r>
-        <w:t>Per costruire la bozza della Power App si può usare JavaFX, un framework che permette di sviluppare applicazioni desktop cross-platform.</w:t>
+        <w:t xml:space="preserve">Per costruire la bozza della Power App si può usare </w:t>
+      </w:r>
+      <w:proofErr w:type="spellStart"/>
+      <w:r>
+        <w:t>JavaFX</w:t>
+      </w:r>
+      <w:proofErr w:type="spellEnd"/>
+      <w:r>
+        <w:t>, un framework che permette di sviluppare applicazioni desktop cross-</w:t>
+      </w:r>
+      <w:proofErr w:type="spellStart"/>
+      <w:r>
+        <w:t>platform</w:t>
+      </w:r>
+      <w:proofErr w:type="spellEnd"/>
+      <w:r>
+        <w:t>.</w:t>
       </w:r>
     </w:p>
     <w:p>
@@ -57,7 +73,15 @@
     </w:p>
     <w:p>
       <w:r>
-        <w:t>Lo script legge due file di testo: Comparti.txt e Eredi.txt. Sarà necessario definire una grammatica per i due file. Lo script effettua un parsing memorizzando la lista dei comparti e degli eredi. Successivamente vengono prodotti in output i file dell’anagrafica e della suddivisione.</w:t>
+        <w:t xml:space="preserve">Lo script legge due file di testo: Comparti.txt e Eredi.txt. Sarà necessario definire una grammatica per i due file. Lo script effettua un </w:t>
+      </w:r>
+      <w:proofErr w:type="spellStart"/>
+      <w:r>
+        <w:t>parsing</w:t>
+      </w:r>
+      <w:proofErr w:type="spellEnd"/>
+      <w:r>
+        <w:t xml:space="preserve"> memorizzando la lista dei comparti e degli eredi. Successivamente vengono prodotti in output i file dell’anagrafica e della suddivisione.</w:t>
       </w:r>
     </w:p>
     <w:p>
@@ -70,7 +94,15 @@
     </w:p>
     <w:p>
       <w:r>
-        <w:t>I file excel sono:</w:t>
+        <w:t xml:space="preserve">I file </w:t>
+      </w:r>
+      <w:proofErr w:type="spellStart"/>
+      <w:r>
+        <w:t>excel</w:t>
+      </w:r>
+      <w:proofErr w:type="spellEnd"/>
+      <w:r>
+        <w:t xml:space="preserve"> sono:</w:t>
       </w:r>
     </w:p>
     <w:p>
@@ -159,20 +191,50 @@
     </w:p>
     <w:p/>
     <w:p>
-      <w:r>
-        <w:t>ISIN: identifica il comparto</w:t>
+      <w:hyperlink r:id="rId5" w:history="1">
+        <w:r>
+          <w:rPr>
+            <w:rStyle w:val="Collegamentoipertestuale"/>
+          </w:rPr>
+          <w:t>ISI</w:t>
+        </w:r>
+        <w:r>
+          <w:rPr>
+            <w:rStyle w:val="Collegamentoipertestuale"/>
+          </w:rPr>
+          <w:t>N</w:t>
+        </w:r>
+      </w:hyperlink>
+      <w:r>
+        <w:t>: identifica il comparto</w:t>
       </w:r>
     </w:p>
     <w:p/>
     <w:p>
       <w:r>
-        <w:t>Per costruire la bozza del programma, inserisci i dati tramite file txt (come il simulatore). Nella prima bozza, la modalità di suddivisione a percentuale fissa è sempre attiva.</w:t>
+        <w:t xml:space="preserve">Per costruire la bozza del programma, inserisci i dati tramite file </w:t>
+      </w:r>
+      <w:proofErr w:type="spellStart"/>
+      <w:r>
+        <w:t>txt</w:t>
+      </w:r>
+      <w:proofErr w:type="spellEnd"/>
+      <w:r>
+        <w:t xml:space="preserve"> (come il simulatore). Nella prima bozza, la modalità di suddivisione a percentuale fissa è sempre attiva.</w:t>
       </w:r>
     </w:p>
     <w:p/>
     <w:p>
       <w:r>
-        <w:t>È necessario specificare le quote che spettano all’erede per ogni coppia (erede, comparto). Il comparto è costituito da quote, che hanno un valore corrispondente in euro. Tuttavia nel file Excel devono essere contenute le quote, non le quantità monetarie.</w:t>
+        <w:t xml:space="preserve">È necessario specificare le quote che spettano all’erede per ogni coppia (erede, comparto). Il comparto è costituito da quote, che hanno un valore corrispondente in euro. </w:t>
+      </w:r>
+      <w:proofErr w:type="gramStart"/>
+      <w:r>
+        <w:t>Tuttavia</w:t>
+      </w:r>
+      <w:proofErr w:type="gramEnd"/>
+      <w:r>
+        <w:t xml:space="preserve"> nel file Excel devono essere contenute le quote, non le quantità monetarie.</w:t>
       </w:r>
     </w:p>
     <w:p>
@@ -226,6 +288,16 @@
       </w:pPr>
       <w:r>
         <w:t>Comparti.txt</w:t>
+      </w:r>
+    </w:p>
+    <w:p>
+      <w:r>
+        <w:t>ISIN</w:t>
+      </w:r>
+    </w:p>
+    <w:p>
+      <w:r>
+        <w:t>Quote disponibili</w:t>
       </w:r>
     </w:p>
     <w:p>
@@ -258,6 +330,33 @@
       </w:pPr>
       <w:r>
         <w:t>Validazione formato codice fiscale</w:t>
+      </w:r>
+      <w:r>
+        <w:t xml:space="preserve"> e IBAN</w:t>
+      </w:r>
+    </w:p>
+    <w:p>
+      <w:pPr>
+        <w:pStyle w:val="Paragrafoelenco"/>
+        <w:numPr>
+          <w:ilvl w:val="0"/>
+          <w:numId w:val="2"/>
+        </w:numPr>
+      </w:pPr>
+      <w:r>
+        <w:t>Validazione ISIN</w:t>
+      </w:r>
+    </w:p>
+    <w:p>
+      <w:pPr>
+        <w:pStyle w:val="Paragrafoelenco"/>
+        <w:numPr>
+          <w:ilvl w:val="0"/>
+          <w:numId w:val="2"/>
+        </w:numPr>
+      </w:pPr>
+      <w:r>
+        <w:t>Controllo che la somma delle quote degli eredi faccia 100%.</w:t>
       </w:r>
     </w:p>
     <w:p/>
@@ -275,7 +374,7 @@
 </file>
 
 <file path=word/numbering.xml><?xml version="1.0" encoding="utf-8"?>
-<w:numbering xmlns:wpc="http://schemas.microsoft.com/office/word/2010/wordprocessingCanvas" xmlns:cx="http://schemas.microsoft.com/office/drawing/2014/chartex" xmlns:cx1="http://schemas.microsoft.com/office/drawing/2015/9/8/chartex" xmlns:cx2="http://schemas.microsoft.com/office/drawing/2015/10/21/chartex" xmlns:cx3="http://schemas.microsoft.com/office/drawing/2016/5/9/chartex" xmlns:cx4="http://schemas.microsoft.com/office/drawing/2016/5/10/chartex" xmlns:cx5="http://schemas.microsoft.com/office/drawing/2016/5/11/chartex" xmlns:cx6="http://schemas.microsoft.com/office/drawing/2016/5/12/chartex" xmlns:cx7="http://schemas.microsoft.com/office/drawing/2016/5/13/chartex" xmlns:cx8="http://schemas.microsoft.com/office/drawing/2016/5/14/chartex" xmlns:mc="http://schemas.openxmlformats.org/markup-compatibility/2006" xmlns:aink="http://schemas.microsoft.com/office/drawing/2016/ink" xmlns:am3d="http://schemas.microsoft.com/office/drawing/2017/model3d" xmlns:o="urn:schemas-microsoft-com:office:office" xmlns:oel="http://schemas.microsoft.com/office/2019/extlst" xmlns:r="http://schemas.openxmlformats.org/officeDocument/2006/relationships" xmlns:m="http://schemas.openxmlformats.org/officeDocument/2006/math" xmlns:v="urn:schemas-microsoft-com:vml" xmlns:wp14="http://schemas.microsoft.com/office/word/2010/wordprocessingDrawing" xmlns:wp="http://schemas.openxmlformats.org/drawingml/2006/wordprocessingDrawing" xmlns:w10="urn:schemas-microsoft-com:office:word" xmlns:w="http://schemas.openxmlformats.org/wordprocessingml/2006/main" xmlns:w14="http://schemas.microsoft.com/office/word/2010/wordml" xmlns:w15="http://schemas.microsoft.com/office/word/2012/wordml" xmlns:w16cei="http://schemas.microsoft.com/office/word/2026/wordml/cei" xmlns:w16cex="http://schemas.microsoft.com/office/word/2018/wordml/cex" xmlns:w16cid="http://schemas.microsoft.com/office/word/2016/wordml/cid" xmlns:w16="http://schemas.microsoft.com/office/word/2018/wordml" xmlns:w16du="http://schemas.microsoft.com/office/word/2023/wordml/word16du" xmlns:w16sdtdh="http://schemas.microsoft.com/office/word/2020/wordml/sdtdatahash" xmlns:w16sdtfl="http://schemas.microsoft.com/office/word/2024/wordml/sdtformatlock" xmlns:w16se="http://schemas.microsoft.com/office/word/2015/wordml/symex" xmlns:wpg="http://schemas.microsoft.com/office/word/2010/wordprocessingGroup" xmlns:wpi="http://schemas.microsoft.com/office/word/2010/wordprocessingInk" xmlns:wne="http://schemas.microsoft.com/office/word/2006/wordml" xmlns:wps="http://schemas.microsoft.com/office/word/2010/wordprocessingShape" mc:Ignorable="w14 w15 w16se w16cid w16 w16cex w16sdtdh w16sdtfl w16du wp14">
+<w:numbering xmlns:wpc="http://schemas.microsoft.com/office/word/2010/wordprocessingCanvas" xmlns:cx="http://schemas.microsoft.com/office/drawing/2014/chartex" xmlns:cx1="http://schemas.microsoft.com/office/drawing/2015/9/8/chartex" xmlns:cx2="http://schemas.microsoft.com/office/drawing/2015/10/21/chartex" xmlns:cx3="http://schemas.microsoft.com/office/drawing/2016/5/9/chartex" xmlns:cx4="http://schemas.microsoft.com/office/drawing/2016/5/10/chartex" xmlns:cx5="http://schemas.microsoft.com/office/drawing/2016/5/11/chartex" xmlns:cx6="http://schemas.microsoft.com/office/drawing/2016/5/12/chartex" xmlns:cx7="http://schemas.microsoft.com/office/drawing/2016/5/13/chartex" xmlns:cx8="http://schemas.microsoft.com/office/drawing/2016/5/14/chartex" xmlns:mc="http://schemas.openxmlformats.org/markup-compatibility/2006" xmlns:aink="http://schemas.microsoft.com/office/drawing/2016/ink" xmlns:am3d="http://schemas.microsoft.com/office/drawing/2017/model3d" xmlns:o="urn:schemas-microsoft-com:office:office" xmlns:oel="http://schemas.microsoft.com/office/2019/extlst" xmlns:r="http://schemas.openxmlformats.org/officeDocument/2006/relationships" xmlns:m="http://schemas.openxmlformats.org/officeDocument/2006/math" xmlns:v="urn:schemas-microsoft-com:vml" xmlns:wp14="http://schemas.microsoft.com/office/word/2010/wordprocessingDrawing" xmlns:wp="http://schemas.openxmlformats.org/drawingml/2006/wordprocessingDrawing" xmlns:w10="urn:schemas-microsoft-com:office:word" xmlns:w="http://schemas.openxmlformats.org/wordprocessingml/2006/main" xmlns:w14="http://schemas.microsoft.com/office/word/2010/wordml" xmlns:w15="http://schemas.microsoft.com/office/word/2012/wordml" xmlns:w16cex="http://schemas.microsoft.com/office/word/2018/wordml/cex" xmlns:w16cid="http://schemas.microsoft.com/office/word/2016/wordml/cid" xmlns:w16="http://schemas.microsoft.com/office/word/2018/wordml" xmlns:w16du="http://schemas.microsoft.com/office/word/2023/wordml/word16du" xmlns:w16sdtdh="http://schemas.microsoft.com/office/word/2020/wordml/sdtdatahash" xmlns:w16sdtfl="http://schemas.microsoft.com/office/word/2024/wordml/sdtformatlock" xmlns:w16se="http://schemas.microsoft.com/office/word/2015/wordml/symex" xmlns:wpg="http://schemas.microsoft.com/office/word/2010/wordprocessingGroup" xmlns:wpi="http://schemas.microsoft.com/office/word/2010/wordprocessingInk" xmlns:wne="http://schemas.microsoft.com/office/word/2006/wordml" xmlns:wps="http://schemas.microsoft.com/office/word/2010/wordprocessingShape" mc:Ignorable="w14 w15 w16se w16cid w16 w16cex w16sdtdh w16sdtfl w16du wp14">
   <w:abstractNum w:abstractNumId="0" w15:restartNumberingAfterBreak="0">
     <w:nsid w:val="1E320E52"/>
     <w:multiLevelType w:val="hybridMultilevel"/>
@@ -1399,6 +1498,41 @@
       <w:spacing w:val="5"/>
     </w:rPr>
   </w:style>
+  <w:style w:type="character" w:styleId="Collegamentoipertestuale">
+    <w:name w:val="Hyperlink"/>
+    <w:basedOn w:val="Carpredefinitoparagrafo"/>
+    <w:uiPriority w:val="99"/>
+    <w:unhideWhenUsed/>
+    <w:rsid w:val="00402A18"/>
+    <w:rPr>
+      <w:color w:val="467886" w:themeColor="hyperlink"/>
+      <w:u w:val="single"/>
+    </w:rPr>
+  </w:style>
+  <w:style w:type="character" w:styleId="Menzionenonrisolta">
+    <w:name w:val="Unresolved Mention"/>
+    <w:basedOn w:val="Carpredefinitoparagrafo"/>
+    <w:uiPriority w:val="99"/>
+    <w:semiHidden/>
+    <w:unhideWhenUsed/>
+    <w:rsid w:val="00402A18"/>
+    <w:rPr>
+      <w:color w:val="605E5C"/>
+      <w:shd w:val="clear" w:color="auto" w:fill="E1DFDD"/>
+    </w:rPr>
+  </w:style>
+  <w:style w:type="character" w:styleId="Collegamentovisitato">
+    <w:name w:val="FollowedHyperlink"/>
+    <w:basedOn w:val="Carpredefinitoparagrafo"/>
+    <w:uiPriority w:val="99"/>
+    <w:semiHidden/>
+    <w:unhideWhenUsed/>
+    <w:rsid w:val="00402A18"/>
+    <w:rPr>
+      <w:color w:val="96607D" w:themeColor="followedHyperlink"/>
+      <w:u w:val="single"/>
+    </w:rPr>
+  </w:style>
 </w:styles>
 </file>
 

</xml_diff>

<commit_message>
Implementato metodo per produrre il file Excel della suddivisione dei fondi. Non è ancora stato collaudato e mancano i test.
</commit_message>
<xml_diff>
--- a/Note Power App.docx
+++ b/Note Power App.docx
@@ -12,23 +12,7 @@
     </w:p>
     <w:p>
       <w:r>
-        <w:t xml:space="preserve">Per costruire la bozza della Power App si può usare </w:t>
-      </w:r>
-      <w:proofErr w:type="spellStart"/>
-      <w:r>
-        <w:t>JavaFX</w:t>
-      </w:r>
-      <w:proofErr w:type="spellEnd"/>
-      <w:r>
-        <w:t>, un framework che permette di sviluppare applicazioni desktop cross-</w:t>
-      </w:r>
-      <w:proofErr w:type="spellStart"/>
-      <w:r>
-        <w:t>platform</w:t>
-      </w:r>
-      <w:proofErr w:type="spellEnd"/>
-      <w:r>
-        <w:t>.</w:t>
+        <w:t>Per costruire la bozza della Power App si può usare JavaFX, un framework che permette di sviluppare applicazioni desktop cross-platform.</w:t>
       </w:r>
     </w:p>
     <w:p>
@@ -36,8 +20,16 @@
         <w:t>Libreria per lavorare con file Excel</w:t>
       </w:r>
       <w:r>
-        <w:t xml:space="preserve"> → Apache POI</w:t>
-      </w:r>
+        <w:t xml:space="preserve"> → </w:t>
+      </w:r>
+      <w:hyperlink r:id="rId5" w:history="1">
+        <w:r>
+          <w:rPr>
+            <w:rStyle w:val="Collegamentoipertestuale"/>
+          </w:rPr>
+          <w:t>Apache POI</w:t>
+        </w:r>
+      </w:hyperlink>
     </w:p>
     <w:p>
       <w:r>
@@ -73,15 +65,7 @@
     </w:p>
     <w:p>
       <w:r>
-        <w:t xml:space="preserve">Lo script legge due file di testo: Comparti.txt e Eredi.txt. Sarà necessario definire una grammatica per i due file. Lo script effettua un </w:t>
-      </w:r>
-      <w:proofErr w:type="spellStart"/>
-      <w:r>
-        <w:t>parsing</w:t>
-      </w:r>
-      <w:proofErr w:type="spellEnd"/>
-      <w:r>
-        <w:t xml:space="preserve"> memorizzando la lista dei comparti e degli eredi. Successivamente vengono prodotti in output i file dell’anagrafica e della suddivisione.</w:t>
+        <w:t>Lo script legge due file di testo: Comparti.txt e Eredi.txt. Sarà necessario definire una grammatica per i due file. Lo script effettua un parsing memorizzando la lista dei comparti e degli eredi. Successivamente vengono prodotti in output i file dell’anagrafica e della suddivisione.</w:t>
       </w:r>
     </w:p>
     <w:p>
@@ -94,15 +78,7 @@
     </w:p>
     <w:p>
       <w:r>
-        <w:t xml:space="preserve">I file </w:t>
-      </w:r>
-      <w:proofErr w:type="spellStart"/>
-      <w:r>
-        <w:t>excel</w:t>
-      </w:r>
-      <w:proofErr w:type="spellEnd"/>
-      <w:r>
-        <w:t xml:space="preserve"> sono:</w:t>
+        <w:t>I file excel sono:</w:t>
       </w:r>
     </w:p>
     <w:p>
@@ -191,18 +167,12 @@
     </w:p>
     <w:p/>
     <w:p>
-      <w:hyperlink r:id="rId5" w:history="1">
+      <w:hyperlink r:id="rId6" w:history="1">
         <w:r>
           <w:rPr>
             <w:rStyle w:val="Collegamentoipertestuale"/>
           </w:rPr>
-          <w:t>ISI</w:t>
-        </w:r>
-        <w:r>
-          <w:rPr>
-            <w:rStyle w:val="Collegamentoipertestuale"/>
-          </w:rPr>
-          <w:t>N</w:t>
+          <w:t>ISIN</w:t>
         </w:r>
       </w:hyperlink>
       <w:r>
@@ -212,15 +182,7 @@
     <w:p/>
     <w:p>
       <w:r>
-        <w:t xml:space="preserve">Per costruire la bozza del programma, inserisci i dati tramite file </w:t>
-      </w:r>
-      <w:proofErr w:type="spellStart"/>
-      <w:r>
-        <w:t>txt</w:t>
-      </w:r>
-      <w:proofErr w:type="spellEnd"/>
-      <w:r>
-        <w:t xml:space="preserve"> (come il simulatore). Nella prima bozza, la modalità di suddivisione a percentuale fissa è sempre attiva.</w:t>
+        <w:t>Per costruire la bozza del programma, inserisci i dati tramite file txt (come il simulatore). Nella prima bozza, la modalità di suddivisione a percentuale fissa è sempre attiva.</w:t>
       </w:r>
     </w:p>
     <w:p/>
@@ -357,6 +319,49 @@
       </w:pPr>
       <w:r>
         <w:t>Controllo che la somma delle quote degli eredi faccia 100%.</w:t>
+      </w:r>
+    </w:p>
+    <w:p>
+      <w:pPr>
+        <w:pStyle w:val="Titolo2"/>
+      </w:pPr>
+      <w:r>
+        <w:t>Output: suddivisione fondi.xlsx</w:t>
+      </w:r>
+    </w:p>
+    <w:p>
+      <w:r>
+        <w:t>Il file contiene una riga per ogni coppia (Erede, Comparto). Ogni riga contiene i seguenti campi:</w:t>
+      </w:r>
+    </w:p>
+    <w:p>
+      <w:r>
+        <w:t>Nome erede</w:t>
+      </w:r>
+    </w:p>
+    <w:p>
+      <w:r>
+        <w:t>Cognome erede</w:t>
+      </w:r>
+    </w:p>
+    <w:p>
+      <w:r>
+        <w:t>Codice fiscale erede</w:t>
+      </w:r>
+    </w:p>
+    <w:p>
+      <w:r>
+        <w:t>IBAN erede</w:t>
+      </w:r>
+    </w:p>
+    <w:p>
+      <w:r>
+        <w:t>ISIN comparto</w:t>
+      </w:r>
+    </w:p>
+    <w:p>
+      <w:r>
+        <w:t>Numero di quote destinate</w:t>
       </w:r>
     </w:p>
     <w:p/>

</xml_diff>